<commit_message>
Toán 12 Độ dài gang tay: sửa hiển thị công thức Excel
Co-Authored-By: Claude Opus 5.5 <noreply@anthropic.com>
</commit_message>
<xml_diff>
--- a/mon/toan/khbd/lop12/KHBD_TOAN12_TNGangTay_T53-54.docx
+++ b/mon/toan/khbd/lop12/KHBD_TOAN12_TNGangTay_T53-54.docx
@@ -4151,19 +4151,7 @@
           <w:rFonts w:ascii="Times New Roman" w:hAnsi="Times New Roman" w:eastAsia="Times New Roman" w:cs="Times New Roman"/>
           <w:sz w:val="24"/>
         </w:rPr>
-        <w:t>Bước 4. Lấy các điểm đại diện trừ đi số trung bình và bình phương kết quả: G2 = (E2-\</w:t>
-      </w:r>
-      <m:oMath>
-        <m:r>
-          <m:t>C\</m:t>
-        </m:r>
-      </m:oMath>
-      <w:r>
-        <w:rPr>
-          <w:rFonts w:ascii="Times New Roman" w:hAnsi="Times New Roman" w:eastAsia="Times New Roman" w:cs="Times New Roman"/>
-          <w:sz w:val="24"/>
-        </w:rPr>
-        <w:t>10)^2 (H.T.15).</w:t>
+        <w:t>Bước 4. Lấy các điểm đại diện trừ đi số trung bình và bình phương kết quả: G2 = (E2 - C10)^2, trong đó ô C10 (số trung bình) được cố định khi sao chép công thức – nhấn phím F4 (H.T.15).</w:t>
       </w:r>
     </w:p>
     <w:p>

</xml_diff>